<commit_message>
Added links to portfolio. Text corrected. Build documents moved to the Release directory.
</commit_message>
<xml_diff>
--- a/Releases/EN/Yuriy_Kobylyatskiy_Senior_Unity_Developer_EN.docx
+++ b/Releases/EN/Yuriy_Kobylyatskiy_Senior_Unity_Developer_EN.docx
@@ -121,7 +121,19 @@
     </w:p>
     <w:p>
       <w:r>
-        <w:t>Senior / Lead Unity Developer with 15+ years in Game Development and 18+ years in Software Development.</w:t>
+        <w:t>Senior / Lead Unity Developer</w:t>
+      </w:r>
+      <w:r>
+        <w:t>,</w:t>
+      </w:r>
+      <w:r>
+        <w:t xml:space="preserve"> 15+ years in Game Development</w:t>
+      </w:r>
+      <w:r>
+        <w:t>,</w:t>
+      </w:r>
+      <w:r>
+        <w:t xml:space="preserve"> 18+ years in Software Development.</w:t>
       </w:r>
     </w:p>
     <w:p>
@@ -436,10 +448,7 @@
         <w:pStyle w:val="a0"/>
       </w:pPr>
       <w:r>
-        <w:t>Developed</w:t>
-      </w:r>
-      <w:r>
-        <w:t xml:space="preserve"> gameplay, AI, combat, UI and production systems for a 2D/3D Unity platformer.</w:t>
+        <w:t>Developed gameplay, AI, combat, UI and production systems for a 2D/3D Unity platformer.</w:t>
       </w:r>
     </w:p>
     <w:p>
@@ -2116,6 +2125,7 @@
   <w:style w:type="character" w:default="1" w:styleId="a2">
     <w:name w:val="Default Paragraph Font"/>
     <w:uiPriority w:val="1"/>
+    <w:semiHidden/>
     <w:unhideWhenUsed/>
   </w:style>
   <w:style w:type="table" w:default="1" w:styleId="a3">

</xml_diff>